<commit_message>
refactor: improve recruitment tag management and suggestions handling
- Updated recruitment service to include soft delete functionality for skills and qualifications.
- Refactored skill and qualification suggestion queries to utilize a shared pagination logic.
- Enhanced ChipsField component to support internationalization with translation hooks.
- Consolidated paginated suggestion logic into a reusable hook for better maintainability.
- Updated UI components to reflect changes in the recruitment tag manager, including improved loading states and user feedback.
- Added Arabic and English translations for new UI strings related to recruitment tags.
</commit_message>
<xml_diff>
--- a/HRHub_QA_Functional_Business_Documentation.docx
+++ b/HRHub_QA_Functional_Business_Documentation.docx
@@ -6852,7 +6852,7 @@
         <w:t>Purpose:</w:t>
       </w:r>
       <w:r>
-        <w:t xml:space="preserve"> Job postings, candidate pipeline (kanban), interviews, public careers site, referrals, convert-to-employee, candidate-source tracking.</w:t>
+        <w:t xml:space="preserve"> Job postings, candidate pipeline (kanban), interviews, public careers site, referrals, convert-to-employee, candidate-source tracking, per-tenant skill/qualification catalogs.</w:t>
       </w:r>
     </w:p>
     <w:p>
@@ -6872,7 +6872,16 @@
         <w:t>hr_manager, super_admin</w:t>
       </w:r>
       <w:r>
-        <w:t xml:space="preserve">. Referral submit: </w:t>
+        <w:t xml:space="preserve">. Skill/qualification catalog manage: </w:t>
+      </w:r>
+      <w:r>
+        <w:rPr>
+          <w:b/>
+        </w:rPr>
+        <w:t>hr_manager, super_admin</w:t>
+      </w:r>
+      <w:r>
+        <w:t xml:space="preserve"> (reads: any authenticated user — job dialogs need them). Referral submit: </w:t>
       </w:r>
       <w:r>
         <w:rPr>
@@ -6986,10 +6995,28 @@
         <w:rPr>
           <w:b/>
         </w:rPr>
-        <w:t>Public careers portal:</w:t>
-      </w:r>
-      <w:r>
-        <w:t xml:space="preserve"> </w:t>
+        <w:t>Skill &amp; qualification catalogs:</w:t>
+      </w:r>
+      <w:r>
+        <w:t xml:space="preserve"> Per-tenant vocabulary powering type-ahead suggestions in job dialogs and résumé-upload forms. Managed in </w:t>
+      </w:r>
+      <w:r>
+        <w:rPr>
+          <w:b/>
+        </w:rPr>
+        <w:t>Org Settings → Recruitment</w:t>
+      </w:r>
+      <w:r>
+        <w:t xml:space="preserve"> (sub-tabs: Stages / Skills / Qualifications) — searchable, server-paginated list (10/page infinite scroll) with add/rename/delete. Names are case-insensitively unique per tenant among live entries; duplicate add/rename → 409. Delete is </w:t>
+      </w:r>
+      <w:r>
+        <w:rPr>
+          <w:b/>
+        </w:rPr>
+        <w:t>soft</w:t>
+      </w:r>
+      <w:r>
+        <w:t xml:space="preserve"> (tombstone; entry vanishes from suggestions, the name is immediately reusable; jobs/candidates keep their own denormalised copies). The catalog is also auto-upserted from job create/update (a deleted name re-enters when a job uses it again). Suggestion endpoints (</w:t>
       </w:r>
       <w:r>
         <w:rPr>
@@ -6997,10 +7024,10 @@
           <w:color w:val="B03060"/>
           <w:sz w:val="19"/>
         </w:rPr>
-        <w:t>/careers/:companyCode/jobs</w:t>
-      </w:r>
-      <w:r>
-        <w:t xml:space="preserve"> (grid, 25/page infinite scroll, filters: search/department/location/type via facets endpoint), </w:t>
+        <w:t>/jobs/skill-suggestions</w:t>
+      </w:r>
+      <w:r>
+        <w:t xml:space="preserve">, </w:t>
       </w:r>
       <w:r>
         <w:rPr>
@@ -7008,10 +7035,39 @@
           <w:color w:val="B03060"/>
           <w:sz w:val="19"/>
         </w:rPr>
-        <w:t>/jobs/:id</w:t>
-      </w:r>
-      <w:r>
-        <w:t xml:space="preserve"> (detail), apply with resume (PDF/DOC/DOCX ≤5MB). Tenant resolved by </w:t>
+        <w:t>/jobs/qualification-suggestions</w:t>
+      </w:r>
+      <w:r>
+        <w:t xml:space="preserve">) are paginated with debounced literal substring search (LIKE metacharacters escaped). Job detail page shows the candidates card with two lenses: </w:t>
+      </w:r>
+      <w:r>
+        <w:rPr>
+          <w:b/>
+        </w:rPr>
+        <w:t>Applicants</w:t>
+      </w:r>
+      <w:r>
+        <w:t xml:space="preserve"> (stage/source filters) and </w:t>
+      </w:r>
+      <w:r>
+        <w:rPr>
+          <w:b/>
+        </w:rPr>
+        <w:t>Recommended</w:t>
+      </w:r>
+      <w:r>
+        <w:t xml:space="preserve"> (talent-pool matches), with count badges; auto-opens Recommended when there are no applicants but matches exist.</w:t>
+      </w:r>
+    </w:p>
+    <w:p>
+      <w:r>
+        <w:rPr>
+          <w:b/>
+        </w:rPr>
+        <w:t>Public careers portal:</w:t>
+      </w:r>
+      <w:r>
+        <w:t xml:space="preserve"> </w:t>
       </w:r>
       <w:r>
         <w:rPr>
@@ -7019,59 +7075,10 @@
           <w:color w:val="B03060"/>
           <w:sz w:val="19"/>
         </w:rPr>
-        <w:t>companyCode</w:t>
-      </w:r>
-      <w:r>
-        <w:t>. Rate limits: browse 60/min, apply 5/10min.</w:t>
-      </w:r>
-    </w:p>
-    <w:p>
-      <w:r>
-        <w:rPr>
-          <w:b/>
-        </w:rPr>
-        <w:t>Notifications/Emails:</w:t>
-      </w:r>
-      <w:r>
-        <w:t xml:space="preserve"> Candidate add/stage-change → WebSocket to HR (live kanban). Public apply → </w:t>
-      </w:r>
-      <w:r>
-        <w:rPr>
-          <w:b/>
-        </w:rPr>
-        <w:t>applicant confirmation email</w:t>
-      </w:r>
-      <w:r>
-        <w:t xml:space="preserve"> + </w:t>
-      </w:r>
-      <w:r>
-        <w:rPr>
-          <w:b/>
-        </w:rPr>
-        <w:t>HR "new application" alert</w:t>
-      </w:r>
-      <w:r>
-        <w:t xml:space="preserve"> (email + in-app). Interview scheduled → </w:t>
-      </w:r>
-      <w:r>
-        <w:rPr>
-          <w:b/>
-        </w:rPr>
-        <w:t>email to candidate + interviewer</w:t>
-      </w:r>
-      <w:r>
-        <w:t xml:space="preserve"> + in-app to interviewer. Convert → employee gets in-app notification.</w:t>
-      </w:r>
-    </w:p>
-    <w:p>
-      <w:r>
-        <w:rPr>
-          <w:b/>
-        </w:rPr>
-        <w:t>Audit:</w:t>
-      </w:r>
-      <w:r>
-        <w:t xml:space="preserve"> job/application/stage/interview/recruitment_stage create/update/delete; public applicant logged with </w:t>
+        <w:t>/careers/:companyCode/jobs</w:t>
+      </w:r>
+      <w:r>
+        <w:t xml:space="preserve"> (grid, 25/page infinite scroll, filters: search/department/location/type via facets endpoint), </w:t>
       </w:r>
       <w:r>
         <w:rPr>
@@ -7079,10 +7086,10 @@
           <w:color w:val="B03060"/>
           <w:sz w:val="19"/>
         </w:rPr>
-        <w:t>actorRole:'public'</w:t>
-      </w:r>
-      <w:r>
-        <w:t xml:space="preserve">, </w:t>
+        <w:t>/jobs/:id</w:t>
+      </w:r>
+      <w:r>
+        <w:t xml:space="preserve"> (detail), apply with resume (PDF/DOC/DOCX ≤5MB). Tenant resolved by </w:t>
       </w:r>
       <w:r>
         <w:rPr>
@@ -7090,10 +7097,59 @@
           <w:color w:val="B03060"/>
           <w:sz w:val="19"/>
         </w:rPr>
-        <w:t>actorId:null</w:t>
-      </w:r>
-      <w:r>
-        <w:t xml:space="preserve">, </w:t>
+        <w:t>companyCode</w:t>
+      </w:r>
+      <w:r>
+        <w:t>. Rate limits: browse 60/min, apply 5/10min.</w:t>
+      </w:r>
+    </w:p>
+    <w:p>
+      <w:r>
+        <w:rPr>
+          <w:b/>
+        </w:rPr>
+        <w:t>Notifications/Emails:</w:t>
+      </w:r>
+      <w:r>
+        <w:t xml:space="preserve"> Candidate add/stage-change → WebSocket to HR (live kanban). Public apply → </w:t>
+      </w:r>
+      <w:r>
+        <w:rPr>
+          <w:b/>
+        </w:rPr>
+        <w:t>applicant confirmation email</w:t>
+      </w:r>
+      <w:r>
+        <w:t xml:space="preserve"> + </w:t>
+      </w:r>
+      <w:r>
+        <w:rPr>
+          <w:b/>
+        </w:rPr>
+        <w:t>HR "new application" alert</w:t>
+      </w:r>
+      <w:r>
+        <w:t xml:space="preserve"> (email + in-app). Interview scheduled → </w:t>
+      </w:r>
+      <w:r>
+        <w:rPr>
+          <w:b/>
+        </w:rPr>
+        <w:t>email to candidate + interviewer</w:t>
+      </w:r>
+      <w:r>
+        <w:t xml:space="preserve"> + in-app to interviewer. Convert → employee gets in-app notification.</w:t>
+      </w:r>
+    </w:p>
+    <w:p>
+      <w:r>
+        <w:rPr>
+          <w:b/>
+        </w:rPr>
+        <w:t>Audit:</w:t>
+      </w:r>
+      <w:r>
+        <w:t xml:space="preserve"> job/application/stage/interview/recruitment_stage create/update/delete; recruitment_skill / recruitment_qualification create/update/delete (catalog CRUD); public applicant logged with </w:t>
       </w:r>
       <w:r>
         <w:rPr>
@@ -7101,6 +7157,28 @@
           <w:color w:val="B03060"/>
           <w:sz w:val="19"/>
         </w:rPr>
+        <w:t>actorRole:'public'</w:t>
+      </w:r>
+      <w:r>
+        <w:t xml:space="preserve">, </w:t>
+      </w:r>
+      <w:r>
+        <w:rPr>
+          <w:rFonts w:ascii="Consolas" w:hAnsi="Consolas"/>
+          <w:color w:val="B03060"/>
+          <w:sz w:val="19"/>
+        </w:rPr>
+        <w:t>actorId:null</w:t>
+      </w:r>
+      <w:r>
+        <w:t xml:space="preserve">, </w:t>
+      </w:r>
+      <w:r>
+        <w:rPr>
+          <w:rFonts w:ascii="Consolas" w:hAnsi="Consolas"/>
+          <w:color w:val="B03060"/>
+          <w:sz w:val="19"/>
+        </w:rPr>
         <w:t>metadata.source='careers_portal'</w:t>
       </w:r>
       <w:r>
@@ -7148,7 +7226,29 @@
         <w:t>QA Checklist (Recruitment):</w:t>
       </w:r>
       <w:r>
-        <w:t xml:space="preserve"> ☐ Functional job CRUD; add candidate; drag stage; interview schedule/feedback; convert; public browse/filter/apply; referral. ☐ Workflow job statuses; pipeline stages; pre_boarding gate; stage-delete block. ☐ Notification WS candidate-added/stage-changed; convert notifies employee. ☐ Email applicant confirmation + HR new-application alert + interview invitations. ☐ Permission HR mutate; public unauthenticated apply; employee referral. ☐ Audit incl. public actorRole; convert dual-entry. ☐ Timeline on converted employee. ☐ Reporting recruitment KPIs + export. ☐ Integration convert→onboarding; careers companyCode resolution; source badge+filter. ☐ Edge duplicate apply (409), resume MIME/size, rate-limit apply, S3 failure swallow, missing companyCode. ☐ Security public endpoint exposure, no CAPTCHA, cross-tenant. ☐ Performance 25/page infinite scroll; facets.</w:t>
+        <w:t xml:space="preserve"> ☐ Functional job CRUD; add candidate; drag stage; interview schedule/feedback; convert; public browse/filter/apply; referral; skill/qualification catalog add/rename/delete + search. ☐ Workflow job statuses; pipeline stages; pre_boarding gate; stage-delete block. ☐ Notification WS candidate-added/stage-changed; convert notifies employee. ☐ Email applicant confirmation + HR new-application alert + interview invitations. ☐ Permission HR mutate; catalog writes HR-only (reads any auth); public unauthenticated apply; employee referral. ☐ Audit incl. public actorRole; convert dual-entry; catalog create/update/delete. ☐ Timeline on converted employee. ☐ Reporting recruitment KPIs + export. ☐ Integration convert→onboarding; careers companyCode resolution; source badge+filter; job-save upserts catalog; type-ahead reflects catalog edits. ☐ Edge duplicate apply (409), duplicate catalog name (409, case-insensitive), deleted catalog name re-addable, </w:t>
+      </w:r>
+      <w:r>
+        <w:rPr>
+          <w:rFonts w:ascii="Consolas" w:hAnsi="Consolas"/>
+          <w:color w:val="B03060"/>
+          <w:sz w:val="19"/>
+        </w:rPr>
+        <w:t>%</w:t>
+      </w:r>
+      <w:r>
+        <w:t>/</w:t>
+      </w:r>
+      <w:r>
+        <w:rPr>
+          <w:rFonts w:ascii="Consolas" w:hAnsi="Consolas"/>
+          <w:color w:val="B03060"/>
+          <w:sz w:val="19"/>
+        </w:rPr>
+        <w:t>_</w:t>
+      </w:r>
+      <w:r>
+        <w:t xml:space="preserve"> searched literally, resume MIME/size, rate-limit apply, S3 failure swallow, missing companyCode. ☐ Security public endpoint exposure, no CAPTCHA, cross-tenant (incl. catalog). ☐ Performance 25/page infinite scroll; facets; suggestion paging 10/page.</w:t>
       </w:r>
     </w:p>
     <w:p>

</xml_diff>